<commit_message>
Verification complete du tp
</commit_message>
<xml_diff>
--- a/Liste de vérification_2026.docx
+++ b/Liste de vérification_2026.docx
@@ -161,6 +161,9 @@
             <w:pPr>
               <w:jc w:val="center"/>
             </w:pPr>
+            <w:r>
+              <w:t>1</w:t>
+            </w:r>
           </w:p>
         </w:tc>
         <w:tc>
@@ -217,6 +220,9 @@
             <w:pPr>
               <w:jc w:val="center"/>
             </w:pPr>
+            <w:r>
+              <w:t>1</w:t>
+            </w:r>
           </w:p>
         </w:tc>
         <w:tc>
@@ -273,6 +279,9 @@
             <w:pPr>
               <w:jc w:val="center"/>
             </w:pPr>
+            <w:r>
+              <w:t>1</w:t>
+            </w:r>
           </w:p>
         </w:tc>
         <w:tc>
@@ -352,6 +361,9 @@
             <w:pPr>
               <w:jc w:val="center"/>
             </w:pPr>
+            <w:r>
+              <w:t>1</w:t>
+            </w:r>
           </w:p>
         </w:tc>
         <w:tc>
@@ -408,6 +420,9 @@
             <w:pPr>
               <w:jc w:val="center"/>
             </w:pPr>
+            <w:r>
+              <w:t>1</w:t>
+            </w:r>
           </w:p>
         </w:tc>
         <w:tc>
@@ -464,6 +479,9 @@
             <w:pPr>
               <w:jc w:val="center"/>
             </w:pPr>
+            <w:r>
+              <w:t>1</w:t>
+            </w:r>
           </w:p>
         </w:tc>
         <w:tc>
@@ -520,6 +538,9 @@
             <w:pPr>
               <w:jc w:val="center"/>
             </w:pPr>
+            <w:r>
+              <w:t>1</w:t>
+            </w:r>
           </w:p>
         </w:tc>
         <w:tc>
@@ -564,7 +585,25 @@
                 <w:sz w:val="20"/>
                 <w:szCs w:val="20"/>
               </w:rPr>
-              <w:t>Les routes sont correctement documentées au format OpenAPI (description, paramètre, valeurs de retour).</w:t>
+              <w:t xml:space="preserve">Les routes sont correctement documentées au format </w:t>
+            </w:r>
+            <w:proofErr w:type="spellStart"/>
+            <w:r>
+              <w:rPr>
+                <w:rFonts w:asciiTheme="majorHAnsi" w:hAnsiTheme="majorHAnsi" w:cstheme="majorHAnsi"/>
+                <w:sz w:val="20"/>
+                <w:szCs w:val="20"/>
+              </w:rPr>
+              <w:t>OpenAPI</w:t>
+            </w:r>
+            <w:proofErr w:type="spellEnd"/>
+            <w:r>
+              <w:rPr>
+                <w:rFonts w:asciiTheme="majorHAnsi" w:hAnsiTheme="majorHAnsi" w:cstheme="majorHAnsi"/>
+                <w:sz w:val="20"/>
+                <w:szCs w:val="20"/>
+              </w:rPr>
+              <w:t xml:space="preserve"> (description, paramètre, valeurs de retour).</w:t>
             </w:r>
           </w:p>
         </w:tc>
@@ -576,6 +615,9 @@
             <w:pPr>
               <w:jc w:val="center"/>
             </w:pPr>
+            <w:r>
+              <w:t>1</w:t>
+            </w:r>
           </w:p>
         </w:tc>
         <w:tc>
@@ -646,6 +688,9 @@
             <w:pPr>
               <w:jc w:val="center"/>
             </w:pPr>
+            <w:r>
+              <w:t>1</w:t>
+            </w:r>
           </w:p>
         </w:tc>
         <w:tc>
@@ -702,6 +747,9 @@
             <w:pPr>
               <w:jc w:val="center"/>
             </w:pPr>
+            <w:r>
+              <w:t>1</w:t>
+            </w:r>
           </w:p>
         </w:tc>
         <w:tc>
@@ -758,6 +806,9 @@
             <w:pPr>
               <w:jc w:val="center"/>
             </w:pPr>
+            <w:r>
+              <w:t>1</w:t>
+            </w:r>
           </w:p>
         </w:tc>
         <w:tc>
@@ -814,6 +865,9 @@
             <w:pPr>
               <w:jc w:val="center"/>
             </w:pPr>
+            <w:r>
+              <w:t>1</w:t>
+            </w:r>
           </w:p>
         </w:tc>
         <w:tc>
@@ -870,6 +924,9 @@
             <w:pPr>
               <w:jc w:val="center"/>
             </w:pPr>
+            <w:r>
+              <w:t>1</w:t>
+            </w:r>
           </w:p>
         </w:tc>
         <w:tc>
@@ -926,6 +983,9 @@
             <w:pPr>
               <w:jc w:val="center"/>
             </w:pPr>
+            <w:r>
+              <w:t>1</w:t>
+            </w:r>
           </w:p>
         </w:tc>
         <w:tc>
@@ -982,6 +1042,9 @@
             <w:pPr>
               <w:jc w:val="center"/>
             </w:pPr>
+            <w:r>
+              <w:t>1</w:t>
+            </w:r>
           </w:p>
         </w:tc>
         <w:tc>
@@ -1052,6 +1115,9 @@
             <w:pPr>
               <w:jc w:val="center"/>
             </w:pPr>
+            <w:r>
+              <w:t>1</w:t>
+            </w:r>
           </w:p>
         </w:tc>
         <w:tc>
@@ -1108,6 +1174,9 @@
             <w:pPr>
               <w:jc w:val="center"/>
             </w:pPr>
+            <w:r>
+              <w:t>1</w:t>
+            </w:r>
           </w:p>
         </w:tc>
         <w:tc>
@@ -1182,6 +1251,9 @@
             <w:pPr>
               <w:jc w:val="center"/>
             </w:pPr>
+            <w:r>
+              <w:t>1</w:t>
+            </w:r>
           </w:p>
         </w:tc>
         <w:tc>
@@ -1238,6 +1310,9 @@
             <w:pPr>
               <w:jc w:val="center"/>
             </w:pPr>
+            <w:r>
+              <w:t>1</w:t>
+            </w:r>
           </w:p>
         </w:tc>
         <w:tc>
@@ -1269,7 +1344,23 @@
                 <w:rFonts w:cstheme="minorHAnsi"/>
                 <w:lang w:val="en-CA"/>
               </w:rPr>
-              <w:t>4. Application de test (Toolpad Studio)</w:t>
+              <w:t>4. Application de test (</w:t>
+            </w:r>
+            <w:proofErr w:type="spellStart"/>
+            <w:r>
+              <w:rPr>
+                <w:rFonts w:cstheme="minorHAnsi"/>
+                <w:lang w:val="en-CA"/>
+              </w:rPr>
+              <w:t>Toolpad</w:t>
+            </w:r>
+            <w:proofErr w:type="spellEnd"/>
+            <w:r>
+              <w:rPr>
+                <w:rFonts w:cstheme="minorHAnsi"/>
+                <w:lang w:val="en-CA"/>
+              </w:rPr>
+              <w:t xml:space="preserve"> Studio)</w:t>
             </w:r>
           </w:p>
         </w:tc>
@@ -1311,6 +1402,9 @@
             <w:pPr>
               <w:jc w:val="center"/>
             </w:pPr>
+            <w:r>
+              <w:t>1</w:t>
+            </w:r>
           </w:p>
         </w:tc>
         <w:tc>
@@ -1355,6 +1449,9 @@
             <w:pPr>
               <w:jc w:val="center"/>
             </w:pPr>
+            <w:r>
+              <w:t>1</w:t>
+            </w:r>
           </w:p>
         </w:tc>
         <w:tc>
@@ -1425,6 +1522,9 @@
             <w:pPr>
               <w:jc w:val="center"/>
             </w:pPr>
+            <w:r>
+              <w:t>1</w:t>
+            </w:r>
           </w:p>
         </w:tc>
         <w:tc>
@@ -1495,6 +1595,9 @@
             <w:pPr>
               <w:jc w:val="center"/>
             </w:pPr>
+            <w:r>
+              <w:t>1</w:t>
+            </w:r>
           </w:p>
         </w:tc>
         <w:tc>
@@ -1595,8 +1698,18 @@
                 <w:sz w:val="20"/>
                 <w:szCs w:val="20"/>
               </w:rPr>
-              <w:t>La base de données est disponible en ligne. Attention à l’expiration des 30 jours pour PostgreSQL sur Render.com..</w:t>
-            </w:r>
+              <w:t xml:space="preserve">La base de données est disponible en ligne. Attention à l’expiration des 30 jours pour PostgreSQL sur </w:t>
+            </w:r>
+            <w:proofErr w:type="gramStart"/>
+            <w:r>
+              <w:rPr>
+                <w:rFonts w:asciiTheme="majorHAnsi" w:hAnsiTheme="majorHAnsi" w:cstheme="majorHAnsi"/>
+                <w:sz w:val="20"/>
+                <w:szCs w:val="20"/>
+              </w:rPr>
+              <w:t>Render.com..</w:t>
+            </w:r>
+            <w:proofErr w:type="gramEnd"/>
           </w:p>
         </w:tc>
         <w:tc>
@@ -2579,6 +2692,15 @@
 </file>
 
 <file path=customXml/item1.xml><?xml version="1.0" encoding="utf-8"?>
+<?mso-contentType ?>
+<FormTemplates xmlns="http://schemas.microsoft.com/sharepoint/v3/contenttype/forms">
+  <Display>DocumentLibraryForm</Display>
+  <Edit>DocumentLibraryForm</Edit>
+  <New>DocumentLibraryForm</New>
+</FormTemplates>
+</file>
+
+<file path=customXml/item2.xml><?xml version="1.0" encoding="utf-8"?>
 <ct:contentTypeSchema xmlns:ct="http://schemas.microsoft.com/office/2006/metadata/contentType" xmlns:ma="http://schemas.microsoft.com/office/2006/metadata/properties/metaAttributes" ct:_="" ma:_="" ma:contentTypeName="Document" ma:contentTypeID="0x01010095FD0977AA16B34898C7F08F4AA9AB9B" ma:contentTypeVersion="4" ma:contentTypeDescription="Crée un document." ma:contentTypeScope="" ma:versionID="05e18cd65ada5fa39c3f19ab6607ea96">
   <xsd:schema xmlns:xsd="http://www.w3.org/2001/XMLSchema" xmlns:xs="http://www.w3.org/2001/XMLSchema" xmlns:p="http://schemas.microsoft.com/office/2006/metadata/properties" xmlns:ns2="fecbedc7-3678-4854-a0fa-b7a0730edfab" targetNamespace="http://schemas.microsoft.com/office/2006/metadata/properties" ma:root="true" ma:fieldsID="fbcfa699519be5b52f9bca89797978be" ns2:_="">
     <xsd:import namespace="fecbedc7-3678-4854-a0fa-b7a0730edfab"/>
@@ -2722,15 +2844,6 @@
 </ct:contentTypeSchema>
 </file>
 
-<file path=customXml/item2.xml><?xml version="1.0" encoding="utf-8"?>
-<?mso-contentType ?>
-<FormTemplates xmlns="http://schemas.microsoft.com/sharepoint/v3/contenttype/forms">
-  <Display>DocumentLibraryForm</Display>
-  <Edit>DocumentLibraryForm</Edit>
-  <New>DocumentLibraryForm</New>
-</FormTemplates>
-</file>
-
 <file path=customXml/item3.xml><?xml version="1.0" encoding="utf-8"?>
 <p:properties xmlns:p="http://schemas.microsoft.com/office/2006/metadata/properties" xmlns:xsi="http://www.w3.org/2001/XMLSchema-instance" xmlns:pc="http://schemas.microsoft.com/office/infopath/2007/PartnerControls">
   <documentManagement>
@@ -2740,13 +2853,37 @@
 </file>
 
 <file path=customXml/itemProps1.xml><?xml version="1.0" encoding="utf-8"?>
-<ds:datastoreItem xmlns:ds="http://schemas.openxmlformats.org/officeDocument/2006/customXml" ds:itemID="{5D6CB8EF-B1C9-4F9F-88E8-AAAA2E29F03F}"/>
+<ds:datastoreItem xmlns:ds="http://schemas.openxmlformats.org/officeDocument/2006/customXml" ds:itemID="{DC46A0E0-C510-4E40-AFC9-1C17AA976312}">
+  <ds:schemaRefs>
+    <ds:schemaRef ds:uri="http://schemas.microsoft.com/sharepoint/v3/contenttype/forms"/>
+  </ds:schemaRefs>
+</ds:datastoreItem>
 </file>
 
 <file path=customXml/itemProps2.xml><?xml version="1.0" encoding="utf-8"?>
-<ds:datastoreItem xmlns:ds="http://schemas.openxmlformats.org/officeDocument/2006/customXml" ds:itemID="{DC46A0E0-C510-4E40-AFC9-1C17AA976312}"/>
+<ds:datastoreItem xmlns:ds="http://schemas.openxmlformats.org/officeDocument/2006/customXml" ds:itemID="{5D6CB8EF-B1C9-4F9F-88E8-AAAA2E29F03F}">
+  <ds:schemaRefs>
+    <ds:schemaRef ds:uri="http://schemas.microsoft.com/office/2006/metadata/contentType"/>
+    <ds:schemaRef ds:uri="http://schemas.microsoft.com/office/2006/metadata/properties/metaAttributes"/>
+    <ds:schemaRef ds:uri="http://www.w3.org/2001/XMLSchema"/>
+    <ds:schemaRef ds:uri="http://schemas.microsoft.com/office/2006/metadata/properties"/>
+    <ds:schemaRef ds:uri="fecbedc7-3678-4854-a0fa-b7a0730edfab"/>
+    <ds:schemaRef ds:uri="http://schemas.microsoft.com/office/2006/documentManagement/types"/>
+    <ds:schemaRef ds:uri="http://schemas.microsoft.com/office/infopath/2007/PartnerControls"/>
+    <ds:schemaRef ds:uri="http://schemas.openxmlformats.org/package/2006/metadata/core-properties"/>
+    <ds:schemaRef ds:uri="http://purl.org/dc/elements/1.1/"/>
+    <ds:schemaRef ds:uri="http://purl.org/dc/terms/"/>
+    <ds:schemaRef ds:uri="http://schemas.microsoft.com/internal/obd"/>
+  </ds:schemaRefs>
+</ds:datastoreItem>
 </file>
 
 <file path=customXml/itemProps3.xml><?xml version="1.0" encoding="utf-8"?>
-<ds:datastoreItem xmlns:ds="http://schemas.openxmlformats.org/officeDocument/2006/customXml" ds:itemID="{D296CD41-9BFB-4156-9D06-4B17CC5A9B2D}"/>
+<ds:datastoreItem xmlns:ds="http://schemas.openxmlformats.org/officeDocument/2006/customXml" ds:itemID="{D296CD41-9BFB-4156-9D06-4B17CC5A9B2D}">
+  <ds:schemaRefs>
+    <ds:schemaRef ds:uri="http://schemas.microsoft.com/office/2006/metadata/properties"/>
+    <ds:schemaRef ds:uri="http://schemas.microsoft.com/office/infopath/2007/PartnerControls"/>
+    <ds:schemaRef ds:uri="fecbedc7-3678-4854-a0fa-b7a0730edfab"/>
+  </ds:schemaRefs>
+</ds:datastoreItem>
 </file>
</xml_diff>